<commit_message>
fix: Vancouver citation order, deficit_adj_ratio bug, fabricated refs
- Reorder all 30 references by first-appearance order (Vancouver style)
- Update all citation {N} markers throughout manuscript body text
- Add Figure 1 citation in Background aims paragraph
- Remove Methods forward-references to Table 3/5, Figure 9
- Fix deficit_adj_ratio: use ratio_tax_funded instead of ratio_total
- Replace 2 fabricated refs (#27 Hamano/Tokuda, #30 Hiramatsu) with
  verified publications (Koike et al BMC PH 2024, Hiyama et al WJG 2006)
- Fix Henke/Ostwald ref: correct journal (IJBHR not Elgar chapter)
- Fix Beylik et al author order to match PubMed

Co-Authored-By: Tatsuki Onishi <bougtoir@gmail.com>
</commit_message>
<xml_diff>
--- a/healthcare_economic_effect/output/docx/Healthcare_EHPM_Manuscript_R1.docx
+++ b/healthcare_economic_effect/output/docx/Healthcare_EHPM_Manuscript_R1.docx
@@ -194,10 +194,50 @@
           <w:sz w:val="20"/>
           <w:vertAlign w:val="superscript"/>
         </w:rPr>
+        <w:t>1</w:t>
+      </w:r>
+      <w:r>
+        <w:t>. With rapid population aging -- the proportion of the population aged 65 and over exceeded 28% in 2019, the highest among OECD nations -- the 'sustainability' of healthcare spending has become a central policy concern</w:t>
+      </w:r>
+      <w:r>
+        <w:rPr>
+          <w:sz w:val="20"/>
+          <w:vertAlign w:val="superscript"/>
+        </w:rPr>
+        <w:t>2</w:t>
+      </w:r>
+      <w:r>
+        <w:t>.</w:t>
+      </w:r>
+    </w:p>
+    <w:p>
+      <w:r>
+        <w:t>Japan faces a uniquely challenging fiscal context: its general account deficit dependency ratio has exceeded 30% in recent years, meaning that roughly one-third of government expenditures are financed by bond issuance rather than current tax revenue</w:t>
+      </w:r>
+      <w:r>
+        <w:rPr>
+          <w:sz w:val="20"/>
+          <w:vertAlign w:val="superscript"/>
+        </w:rPr>
+        <w:t>3</w:t>
+      </w:r>
+      <w:r>
+        <w:t>. The national debt-to-GDP ratio exceeds 250%, the highest among advanced economies</w:t>
+      </w:r>
+      <w:r>
+        <w:rPr>
+          <w:sz w:val="20"/>
+          <w:vertAlign w:val="superscript"/>
+        </w:rPr>
         <w:t>4</w:t>
       </w:r>
       <w:r>
-        <w:t>. With rapid population aging -- the proportion of the population aged 65 and over exceeded 28% in 2019, the highest among OECD nations -- the 'sustainability' of healthcare spending has become a central policy concern</w:t>
+        <w:t>. Healthcare expenditure, which constitutes approximately 12% of general account expenditures, is thus partially financed by deficit spending. Moreover, Japan's super-aged society -- characterized by a growing elderly demographic (projected 35% aged 65+ by 2040) alongside a shrinking workforce (projected 20% decline by 2040) -- places structural pressure on both the revenue and expenditure sides of healthcare financing.</w:t>
+      </w:r>
+    </w:p>
+    <w:p>
+      <w:r>
+        <w:t>A distinctive feature of Japan's system is the Late-Stage Elderly Healthcare System (Kouki Koreisha Iryo Seido), which provides a separate insurance framework for individuals aged 75 and over</w:t>
       </w:r>
       <w:r>
         <w:rPr>
@@ -207,12 +247,177 @@
         <w:t>5</w:t>
       </w:r>
       <w:r>
-        <w:t>.</w:t>
+        <w:t>. Unlike many European countries where the institutional framework remains unified, with the elderly protected through subsidized premiums or exemptions, Japan changes the actual insurance 'container' upon reaching age 75. This system is financed by a combination of patient co-payments (10-30%), premiums from enrollees, cross-subsidies from working-age insurance schemes, and public subsidies. The increasing weight of this system -- already covering approximately 18 million enrollees -- is a key driver of aggregate healthcare expenditure growth.</w:t>
       </w:r>
     </w:p>
     <w:p>
       <w:r>
-        <w:t>Japan faces a uniquely challenging fiscal context: its general account deficit dependency ratio has exceeded 30% in recent years, meaning that roughly one-third of government expenditures are financed by bond issuance rather than current tax revenue</w:t>
+        <w:t>This discourse has almost uniformly treated healthcare expenditure as a 'cost' -- an expense to be minimized through efficiency gains, volume controls, and fee schedule revisions. Yet healthcare is also a major economic sector. It purchases inputs from pharmaceuticals, medical devices, and information technology; it employs millions of workers; and these workers spend their incomes, generating further economic activity throughout the economy. Maeda estimated that Japan's healthcare sector supports 6.89 million jobs in total (2.95 million direct, approximately 4 million indirect), with production-inducement effects exceeding those of any other service industry including construction and education</w:t>
+      </w:r>
+      <w:r>
+        <w:rPr>
+          <w:sz w:val="20"/>
+          <w:vertAlign w:val="superscript"/>
+        </w:rPr>
+        <w:t>6</w:t>
+      </w:r>
+      <w:r>
+        <w:t>.</w:t>
+      </w:r>
+    </w:p>
+    <w:p>
+      <w:r>
+        <w:t>Input-output (I-O) analysis, pioneered by Leontief, quantifies how final demand in one sector induces production across the entire economy through direct, indirect, and induced effects. Yamada and Imanaka reported a healthcare I-O output multiplier of 2.78 (95% confidence interval [CI]: 2.74-2.90) for Japan</w:t>
+      </w:r>
+      <w:r>
+        <w:rPr>
+          <w:sz w:val="20"/>
+          <w:vertAlign w:val="superscript"/>
+        </w:rPr>
+        <w:t>7</w:t>
+      </w:r>
+      <w:r>
+        <w:t>, meaning that each unit of healthcare spending generates 2.78 units of total economic output. Output multipliers ranging from 1.7 to 2.9 have been estimated across OECD countries</w:t>
+      </w:r>
+      <w:r>
+        <w:rPr>
+          <w:sz w:val="20"/>
+          <w:vertAlign w:val="superscript"/>
+        </w:rPr>
+        <w:t>8-10</w:t>
+      </w:r>
+      <w:r>
+        <w:t>. It is important to note that these are output multipliers -- they measure total output induced, not value added (GDP contribution). Value-added multipliers, which exclude intermediate consumption, are typically 40-60% smaller</w:t>
+      </w:r>
+      <w:r>
+        <w:rPr>
+          <w:sz w:val="20"/>
+          <w:vertAlign w:val="superscript"/>
+        </w:rPr>
+        <w:t>9</w:t>
+      </w:r>
+      <w:r>
+        <w:t>. This distinction is critical when relating multiplier effects to tax revenues, which are levied on value added and income rather than gross output.</w:t>
+      </w:r>
+    </w:p>
+    <w:p>
+      <w:r>
+        <w:t>On the supply side, health has long been recognized as a component of human capital that generates long-term economic returns. Mushkin conceptualized health as an investment with returns analogous to education</w:t>
+      </w:r>
+      <w:r>
+        <w:rPr>
+          <w:sz w:val="20"/>
+          <w:vertAlign w:val="superscript"/>
+        </w:rPr>
+        <w:t>11</w:t>
+      </w:r>
+      <w:r>
+        <w:t>, and Grossman's health-capital model formally describes individual health stock as accumulated through investment and depreciated by aging and disease</w:t>
+      </w:r>
+      <w:r>
+        <w:rPr>
+          <w:sz w:val="20"/>
+          <w:vertAlign w:val="superscript"/>
+        </w:rPr>
+        <w:t>12</w:t>
+      </w:r>
+      <w:r>
+        <w:t>. At the macro level, Bloom, Canning, and Sevilla demonstrated that improved population health raises total factor productivity</w:t>
+      </w:r>
+      <w:r>
+        <w:rPr>
+          <w:sz w:val="20"/>
+          <w:vertAlign w:val="superscript"/>
+        </w:rPr>
+        <w:t>13</w:t>
+      </w:r>
+      <w:r>
+        <w:t>. Barro estimated that a one-year increase in life expectancy at birth raises GDP growth by approximately 0.04 percentage points</w:t>
+      </w:r>
+      <w:r>
+        <w:rPr>
+          <w:sz w:val="20"/>
+          <w:vertAlign w:val="superscript"/>
+        </w:rPr>
+        <w:t>14</w:t>
+      </w:r>
+      <w:r>
+        <w:t>.</w:t>
+      </w:r>
+    </w:p>
+    <w:p>
+      <w:r>
+        <w:t>The Health-Led Growth Hypothesis (HLGH) synthesizes these supply-side effects, positing bidirectional Granger causality between health expenditure and GDP growth. Multiple studies have confirmed this relationship across OECD and developing countries using diverse econometric specifications</w:t>
+      </w:r>
+      <w:r>
+        <w:rPr>
+          <w:sz w:val="20"/>
+          <w:vertAlign w:val="superscript"/>
+        </w:rPr>
+        <w:t>15-19</w:t>
+      </w:r>
+      <w:r>
+        <w:t>.</w:t>
+      </w:r>
+    </w:p>
+    <w:p>
+      <w:r>
+        <w:t>A further analytical dimension comes from the Bongaarts-Feeney tempo framework. Bongaarts and Feeney demonstrated that rising mean age at childbearing mechanically depresses the period total fertility rate even when cohort fertility is unchanged</w:t>
+      </w:r>
+      <w:r>
+        <w:rPr>
+          <w:sz w:val="20"/>
+          <w:vertAlign w:val="superscript"/>
+        </w:rPr>
+        <w:t>20</w:t>
+      </w:r>
+      <w:r>
+        <w:t>. Goldstein, Lutz, and Scherbov introduced the parity-specific variance sigma, substantially improving tempo adjustment</w:t>
+      </w:r>
+      <w:r>
+        <w:rPr>
+          <w:sz w:val="20"/>
+          <w:vertAlign w:val="superscript"/>
+        </w:rPr>
+        <w:t>21</w:t>
+      </w:r>
+      <w:r>
+        <w:t>. Onishi ported this quantum-tempo decomposition to capital accounting, introducing the investment-to-output time-to-build lag as an analogous 'forgotten parameter' in GDP accounting</w:t>
+      </w:r>
+      <w:r>
+        <w:rPr>
+          <w:sz w:val="20"/>
+          <w:vertAlign w:val="superscript"/>
+        </w:rPr>
+        <w:t>22</w:t>
+      </w:r>
+      <w:r>
+        <w:t>. Extension to healthcare (termed 'Candidate A-H')</w:t>
+      </w:r>
+      <w:r>
+        <w:rPr>
+          <w:sz w:val="20"/>
+          <w:vertAlign w:val="superscript"/>
+        </w:rPr>
+        <w:t>23</w:t>
+      </w:r>
+      <w:r>
+        <w:t xml:space="preserve"> models the spending-to-outcome lag and revealed a tempo drift of +0.15 yr/yr across 39 countries (2000-2019).</w:t>
+      </w:r>
+    </w:p>
+    <w:p>
+      <w:r>
+        <w:t>Japan is also known for its extremely high diagnostic imaging equipment density</w:t>
+      </w:r>
+      <w:r>
+        <w:rPr>
+          <w:sz w:val="20"/>
+          <w:vertAlign w:val="superscript"/>
+        </w:rPr>
+        <w:t>1,24</w:t>
+      </w:r>
+      <w:r>
+        <w:t>. Japan has 115.7 computed tomography (CT) scanners per million population, approximately 4.3 times the OECD median, and 55.2 magnetic resonance imaging (MRI) units per million, approximately 2.9 times the OECD median. This high density is frequently cited as evidence of 'excess' in the Japanese healthcare system. Simultaneously, Japan is a net importer of medical devices and pharmaceuticals, with import leakage representing approximately 5.0% of CHE</w:t>
       </w:r>
       <w:r>
         <w:rPr>
@@ -222,22 +427,12 @@
         <w:t>25</w:t>
       </w:r>
       <w:r>
-        <w:t>. The national debt-to-GDP ratio exceeds 250%, the highest among advanced economies</w:t>
-      </w:r>
-      <w:r>
-        <w:rPr>
-          <w:sz w:val="20"/>
-          <w:vertAlign w:val="superscript"/>
-        </w:rPr>
-        <w:t>30</w:t>
-      </w:r>
-      <w:r>
-        <w:t>. Healthcare expenditure, which constitutes approximately 12% of general account expenditures, is thus partially financed by deficit spending. Moreover, Japan's super-aged society -- characterized by a growing elderly demographic (projected 35% aged 65+ by 2040) alongside a shrinking workforce (projected 20% decline by 2040) -- places structural pressure on both the revenue and expenditure sides of healthcare financing.</w:t>
+        <w:t>.</w:t>
       </w:r>
     </w:p>
     <w:p>
       <w:r>
-        <w:t>A distinctive feature of Japan's system is the Late-Stage Elderly Healthcare System (Kouki Koreisha Iryo Seido), which provides a separate insurance framework for individuals aged 75 and over</w:t>
+        <w:t>An important structural context is Japan's physician density: at 2.5 physicians per 1,000 population, Japan ranks among the lowest in the OECD (average 3.7)</w:t>
       </w:r>
       <w:r>
         <w:rPr>
@@ -247,19 +442,14 @@
         <w:t>26</w:t>
       </w:r>
       <w:r>
-        <w:t>. Unlike many European countries where the institutional framework remains unified, with the elderly protected through subsidized premiums or exemptions, Japan changes the actual insurance 'container' upon reaching age 75. This system is financed by a combination of patient co-payments (10-30%), premiums from enrollees, cross-subsidies from working-age insurance schemes, and public subsidies. The increasing weight of this system -- already covering approximately 18 million enrollees -- is a key driver of aggregate healthcare expenditure growth.</w:t>
-      </w:r>
-    </w:p>
-    <w:p>
-      <w:r>
-        <w:t>This discourse has almost uniformly treated healthcare expenditure as a 'cost' -- an expense to be minimized through efficiency gains, volume controls, and fee schedule revisions. Yet healthcare is also a major economic sector. It purchases inputs from pharmaceuticals, medical devices, and information technology; it employs millions of workers; and these workers spend their incomes, generating further economic activity throughout the economy. Maeda estimated that Japan's healthcare sector supports 6.89 million jobs in total (2.95 million direct, approximately 4 million indirect), with production-inducement effects exceeding those of any other service industry including construction and education</w:t>
+        <w:t>. This low physician density, combined with free access to specialists and the world's highest diagnostic equipment density, raises questions about the sustainability of current service levels, particularly as work-style reform legislation limits physician overtime</w:t>
       </w:r>
       <w:r>
         <w:rPr>
           <w:sz w:val="20"/>
           <w:vertAlign w:val="superscript"/>
         </w:rPr>
-        <w:t>6</w:t>
+        <w:t>27</w:t>
       </w:r>
       <w:r>
         <w:t>.</w:t>
@@ -267,27 +457,78 @@
     </w:p>
     <w:p>
       <w:r>
-        <w:t>Input-output (I-O) analysis, pioneered by Leontief, quantifies how final demand in one sector induces production across the entire economy through direct, indirect, and induced effects. Yamada and Imanaka reported a healthcare I-O output multiplier of 2.78 (95% confidence interval [CI]: 2.74-2.90) for Japan</w:t>
+        <w:t>The aim of this study was to (1) evaluate the sustainability of Japan's healthcare expenditure from a neutral standpoint as both cost and economic effect, using a dual-return framework integrating demand-side I-O multipliers and supply-side health-capital tempo effects, (2) quantify the role of diagnostic equipment stock and import leakage, (3) construct counterfactual scenarios with sensitivity analysis, and (4) benchmark Japan against 12 additional OECD countries. The conceptual framework is illustrated in Figure 1.</w:t>
+      </w:r>
+    </w:p>
+    <w:p>
+      <w:pPr>
+        <w:pStyle w:val="Heading1"/>
+      </w:pPr>
+      <w:r>
+        <w:t>Methods</w:t>
+      </w:r>
+    </w:p>
+    <w:p>
+      <w:pPr>
+        <w:pStyle w:val="Heading2"/>
+      </w:pPr>
+      <w:r>
+        <w:t>Study design and data sources</w:t>
+      </w:r>
+    </w:p>
+    <w:p>
+      <w:r>
+        <w:t>This study is a cross-country ecological analysis using publicly available data from OECD Health at a Glance 2023</w:t>
       </w:r>
       <w:r>
         <w:rPr>
           <w:sz w:val="20"/>
           <w:vertAlign w:val="superscript"/>
         </w:rPr>
-        <w:t>1</w:t>
-      </w:r>
-      <w:r>
-        <w:t>, meaning that each unit of healthcare spending generates 2.78 units of total economic output. Output multipliers ranging from 1.7 to 2.9 have been estimated across OECD countries</w:t>
+        <w:t>1,24</w:t>
+      </w:r>
+      <w:r>
+        <w:t>, the World Bank World Development Indicators</w:t>
       </w:r>
       <w:r>
         <w:rPr>
           <w:sz w:val="20"/>
           <w:vertAlign w:val="superscript"/>
         </w:rPr>
-        <w:t>2,3,20</w:t>
-      </w:r>
-      <w:r>
-        <w:t>. It is important to note that these are output multipliers -- they measure total output induced, not value added (GDP contribution). Value-added multipliers, which exclude intermediate consumption, are typically 40-60% smaller</w:t>
+        <w:t>28</w:t>
+      </w:r>
+      <w:r>
+        <w:t>, published I-O studies of healthcare sectors</w:t>
+      </w:r>
+      <w:r>
+        <w:rPr>
+          <w:sz w:val="20"/>
+          <w:vertAlign w:val="superscript"/>
+        </w:rPr>
+        <w:t>6-10</w:t>
+      </w:r>
+      <w:r>
+        <w:t>, Health-Led Growth Hypothesis panel studies</w:t>
+      </w:r>
+      <w:r>
+        <w:rPr>
+          <w:sz w:val="20"/>
+          <w:vertAlign w:val="superscript"/>
+        </w:rPr>
+        <w:t>15-19</w:t>
+      </w:r>
+      <w:r>
+        <w:t>, pharmaceutical/device trade statistics</w:t>
+      </w:r>
+      <w:r>
+        <w:rPr>
+          <w:sz w:val="20"/>
+          <w:vertAlign w:val="superscript"/>
+        </w:rPr>
+        <w:t>25</w:t>
+      </w:r>
+      <w:r>
+        <w:t>, and Japanese fiscal data from the Ministry of Finance</w:t>
       </w:r>
       <w:r>
         <w:rPr>
@@ -297,127 +538,183 @@
         <w:t>3</w:t>
       </w:r>
       <w:r>
-        <w:t>. This distinction is critical when relating multiplier effects to tax revenues, which are levied on value added and income rather than gross output.</w:t>
-      </w:r>
-    </w:p>
-    <w:p>
-      <w:r>
-        <w:t>On the supply side, health has long been recognized as a component of human capital that generates long-term economic returns. Mushkin conceptualized health as an investment with returns analogous to education</w:t>
+        <w:t xml:space="preserve"> and Bank of Japan</w:t>
       </w:r>
       <w:r>
         <w:rPr>
           <w:sz w:val="20"/>
           <w:vertAlign w:val="superscript"/>
         </w:rPr>
-        <w:t>12</w:t>
-      </w:r>
-      <w:r>
-        <w:t>, and Grossman's health-capital model formally describes individual health stock as accumulated through investment and depreciated by aging and disease</w:t>
+        <w:t>4</w:t>
+      </w:r>
+      <w:r>
+        <w:t>. As an analysis of publicly available aggregate data, no ethical approval was required.</w:t>
+      </w:r>
+    </w:p>
+    <w:p>
+      <w:pPr>
+        <w:pStyle w:val="Heading2"/>
+      </w:pPr>
+      <w:r>
+        <w:t>Country selection</w:t>
+      </w:r>
+    </w:p>
+    <w:p>
+      <w:r>
+        <w:t>Thirteen OECD countries were selected based on availability of healthcare sector I-O multiplier estimates: Japan, USA, Germany, Australia, Korea, Italy, France, UK, Canada, Sweden, Spain, Netherlands, and Finland. All countries had either a direct I-O study published in a peer-reviewed journal or backward-linkage coefficients from the EU-28 framework study</w:t>
       </w:r>
       <w:r>
         <w:rPr>
           <w:sz w:val="20"/>
           <w:vertAlign w:val="superscript"/>
         </w:rPr>
-        <w:t>13</w:t>
-      </w:r>
-      <w:r>
-        <w:t>. At the macro level, Bloom, Canning, and Sevilla demonstrated that improved population health raises total factor productivity</w:t>
+        <w:t>9</w:t>
+      </w:r>
+      <w:r>
+        <w:t>.</w:t>
+      </w:r>
+    </w:p>
+    <w:p>
+      <w:pPr>
+        <w:pStyle w:val="Heading2"/>
+      </w:pPr>
+      <w:r>
+        <w:t>Fiscal return ratio</w:t>
+      </w:r>
+    </w:p>
+    <w:p>
+      <w:r>
+        <w:t>For each country, we calculated a demand-side fiscal return ratio as an indicator of whether healthcare-induced economic activity generates sufficient tax revenue to cover public healthcare costs:</w:t>
+      </w:r>
+    </w:p>
+    <w:p>
+      <w:pPr>
+        <w:jc w:val="center"/>
+      </w:pPr>
+      <w:r>
+        <w:rPr>
+          <w:i/>
+          <w:sz w:val="24"/>
+        </w:rPr>
+        <w:t>Fiscal Return Ratio = (τ × m) / pf</w:t>
+      </w:r>
+    </w:p>
+    <w:p>
+      <w:r>
+        <w:t>where τ is the effective tax rate (total tax and social insurance contributions as a proportion of GDP), m is the healthcare sector I-O output multiplier, and pf is the public financing share of CHE.</w:t>
+      </w:r>
+    </w:p>
+    <w:p>
+      <w:r>
+        <w:t>A critical methodological caveat must be noted: the I-O multipliers used in this study are output multipliers, measuring total production induced per unit of final demand. These differ from value-added (VA) multipliers, which measure the GDP contribution by subtracting intermediate inputs. Because the effective tax rate τ is expressed as tax revenue divided by GDP (a value-added measure), multiplying τ by an output multiplier conflates output and value added, potentially overstating the induced tax revenue. We therefore present results using both output multipliers (as an upper bound) and approximate VA multipliers (output multiplier times the sector-specific VA/output ratio, approximately 0.55-0.60 for healthcare in OECD countries</w:t>
       </w:r>
       <w:r>
         <w:rPr>
           <w:sz w:val="20"/>
           <w:vertAlign w:val="superscript"/>
         </w:rPr>
-        <w:t>14</w:t>
-      </w:r>
-      <w:r>
-        <w:t>. Barro estimated that a one-year increase in life expectancy at birth raises GDP growth by approximately 0.04 percentage points</w:t>
+        <w:t>9</w:t>
+      </w:r>
+      <w:r>
+        <w:t>) as a more conservative estimate. Neither estimate accounts for opportunity costs: in an economy near full employment, resources employed in healthcare would generate alternative output and tax revenue elsewhere, reducing the net fiscal return attributable to healthcare spending.</w:t>
+      </w:r>
+    </w:p>
+    <w:p>
+      <w:r>
+        <w:t>Additionally, we computed a deficit-adjusted variant of the ratio. When the public financing share is partly funded by deficit (bond) issuance rather than current taxation, a ratio above 1.0 reflects only a temporary flow of single-year tax revenue and does not account for the long-term cost of servicing the accumulated debt</w:t>
       </w:r>
       <w:r>
         <w:rPr>
           <w:sz w:val="20"/>
           <w:vertAlign w:val="superscript"/>
         </w:rPr>
-        <w:t>15</w:t>
-      </w:r>
-      <w:r>
-        <w:t>.</w:t>
+        <w:t>3,4</w:t>
+      </w:r>
+      <w:r>
+        <w:t>. For Japan, the general account deficit dependency ratio was approximately 35% in recent fiscal years. We report results both with and without this adjustment.</w:t>
       </w:r>
     </w:p>
     <w:p>
-      <w:r>
-        <w:t>The Health-Led Growth Hypothesis (HLGH) synthesizes these supply-side effects, positing bidirectional Granger causality between health expenditure and GDP growth. Multiple studies have confirmed this relationship across OECD and developing countries using diverse econometric specifications</w:t>
+      <w:pPr>
+        <w:pStyle w:val="Heading2"/>
+      </w:pPr>
+      <w:r>
+        <w:t>Tempo model specification</w:t>
+      </w:r>
+    </w:p>
+    <w:p>
+      <w:r>
+        <w:t>The tempo model, fully specified in the companion proof-of-concept (publicly available at ref 23), captures supply-side health-capital accumulation. The model treats health expenditure as a stock-building flow with a time-varying spending-to-outcome lag:</w:t>
+      </w:r>
+    </w:p>
+    <w:p>
+      <w:pPr>
+        <w:jc w:val="center"/>
+      </w:pPr>
+      <w:r>
+        <w:rPr>
+          <w:i/>
+          <w:sz w:val="24"/>
+        </w:rPr>
+        <w:t>LE(t) = α + β · H_stock(t) + ε(t)</w:t>
+      </w:r>
+    </w:p>
+    <w:p>
+      <w:r>
+        <w:t>where LE(t) is life expectancy at birth, H_stock(t) is the health-capital stock constructed via perpetual inventory method from per-capita health expenditure (PPP) using World Bank data (2000-2019, 39 countries). The investment-to-outcome lag is specified as:</w:t>
+      </w:r>
+    </w:p>
+    <w:p>
+      <w:pPr>
+        <w:jc w:val="center"/>
+      </w:pPr>
+      <w:r>
+        <w:rPr>
+          <w:i/>
+          <w:sz w:val="24"/>
+        </w:rPr>
+        <w:t>μ_H(t) = μ_H0 + μ_H1 × (year − t₀)</w:t>
+      </w:r>
+    </w:p>
+    <w:p>
+      <w:r>
+        <w:t>Three model variants were compared: M0 (flow-only, no lag, 2 parameters), M1 (constant lag μ* = 4 years, 3 parameters), and M2 (time-varying lag, 5 parameters: intercept, slope, μ_H0, μ_H1, and drift variance). The dependent variable was life expectancy at birth; estimation was by nonlinear least squares with grid search over the lag parameters. Key M2 point estimates: μ_H0 = 3.2 years (SE = 0.8), μ_H1 = +0.15 yr/yr (SE = 0.04), where μ_H0 is the initial spending-to-outcome lag and μ_H1 is the annual drift in this lag</w:t>
       </w:r>
       <w:r>
         <w:rPr>
           <w:sz w:val="20"/>
           <w:vertAlign w:val="superscript"/>
         </w:rPr>
-        <w:t>7-11</w:t>
+        <w:t>23</w:t>
       </w:r>
       <w:r>
         <w:t>.</w:t>
       </w:r>
     </w:p>
     <w:p>
-      <w:r>
-        <w:t>A further analytical dimension comes from the Bongaarts-Feeney tempo framework. Bongaarts and Feeney demonstrated that rising mean age at childbearing mechanically depresses the period total fertility rate even when cohort fertility is unchanged</w:t>
-      </w:r>
-      <w:r>
-        <w:rPr>
-          <w:sz w:val="20"/>
-          <w:vertAlign w:val="superscript"/>
-        </w:rPr>
-        <w:t>16</w:t>
-      </w:r>
-      <w:r>
-        <w:t>. Goldstein, Lutz, and Scherbov introduced the parity-specific variance sigma, substantially improving tempo adjustment</w:t>
-      </w:r>
-      <w:r>
-        <w:rPr>
-          <w:sz w:val="20"/>
-          <w:vertAlign w:val="superscript"/>
-        </w:rPr>
-        <w:t>17</w:t>
-      </w:r>
-      <w:r>
-        <w:t>. Onishi ported this quantum-tempo decomposition to capital accounting, introducing the investment-to-output time-to-build lag as an analogous 'forgotten parameter' in GDP accounting</w:t>
-      </w:r>
-      <w:r>
-        <w:rPr>
-          <w:sz w:val="20"/>
-          <w:vertAlign w:val="superscript"/>
-        </w:rPr>
-        <w:t>18</w:t>
-      </w:r>
-      <w:r>
-        <w:t>. Extension to healthcare (termed 'Candidate A-H')</w:t>
-      </w:r>
-      <w:r>
-        <w:rPr>
-          <w:sz w:val="20"/>
-          <w:vertAlign w:val="superscript"/>
-        </w:rPr>
-        <w:t>19</w:t>
-      </w:r>
-      <w:r>
-        <w:t xml:space="preserve"> models the spending-to-outcome lag and revealed a tempo drift of +0.15 yr/yr across 39 countries (2000-2019).</w:t>
+      <w:pPr>
+        <w:pStyle w:val="Heading2"/>
+      </w:pPr>
+      <w:r>
+        <w:t>Model selection criteria</w:t>
       </w:r>
     </w:p>
     <w:p>
       <w:r>
-        <w:t>Japan is also known for its extremely high diagnostic imaging equipment density</w:t>
-      </w:r>
-      <w:r>
-        <w:rPr>
-          <w:sz w:val="20"/>
-          <w:vertAlign w:val="superscript"/>
-        </w:rPr>
-        <w:t>4,23</w:t>
-      </w:r>
-      <w:r>
-        <w:t>. Japan has 115.7 computed tomography (CT) scanners per million population, approximately 4.3 times the OECD median, and 55.2 magnetic resonance imaging (MRI) units per million, approximately 2.9 times the OECD median. This high density is frequently cited as evidence of 'excess' in the Japanese healthcare system. Simultaneously, Japan is a net importer of medical devices and pharmaceuticals, with import leakage representing approximately 5.0% of CHE</w:t>
+        <w:t>To ensure symmetric application of model selection criteria across all analyses (as applied to the Preston Curve test below), we evaluated all tempo model variants using: (a) in-sample level RMSE, (b) change RMSE, (c) leave-one-out cross-validation (LOOCV) RMSE, (d) Akaike Information Criterion (AIC), and (e) Bayesian Information Criterion (BIC). AIC and BIC penalize model complexity, with BIC imposing a heavier penalty for additional parameters. All criteria are reported in the Results section.</w:t>
+      </w:r>
+    </w:p>
+    <w:p>
+      <w:pPr>
+        <w:pStyle w:val="Heading2"/>
+      </w:pPr>
+      <w:r>
+        <w:t>Equipment stock and import leakage model</w:t>
+      </w:r>
+    </w:p>
+    <w:p>
+      <w:r>
+        <w:t>Diagnostic imaging equipment density was defined as the sum of CT scanners and MRI units per million population</w:t>
       </w:r>
       <w:r>
         <w:rPr>
@@ -427,37 +724,70 @@
         <w:t>24</w:t>
       </w:r>
       <w:r>
-        <w:t>.</w:t>
-      </w:r>
-    </w:p>
-    <w:p>
-      <w:r>
-        <w:t>An important structural context is Japan's physician density: at 2.5 physicians per 1,000 population, Japan ranks among the lowest in the OECD (average 3.7)</w:t>
+        <w:t>. Medical import leakage was calculated as the net imports of pharmaceuticals (HS30) and medical devices (HS9018-22) divided by CHE</w:t>
       </w:r>
       <w:r>
         <w:rPr>
           <w:sz w:val="20"/>
           <w:vertAlign w:val="superscript"/>
         </w:rPr>
-        <w:t>27</w:t>
-      </w:r>
-      <w:r>
-        <w:t>. This low physician density, combined with free access to specialists and the world's highest diagnostic equipment density, raises questions about the sustainability of current service levels, particularly as work-style reform legislation limits physician overtime</w:t>
+        <w:t>25</w:t>
+      </w:r>
+      <w:r>
+        <w:t>. The effective I-O multiplier was defined as:</w:t>
+      </w:r>
+    </w:p>
+    <w:p>
+      <w:pPr>
+        <w:jc w:val="center"/>
+      </w:pPr>
+      <w:r>
+        <w:rPr>
+          <w:i/>
+          <w:sz w:val="24"/>
+        </w:rPr>
+        <w:t>m_eff = m × (1 − import leakage rate)</w:t>
+      </w:r>
+    </w:p>
+    <w:p>
+      <w:pPr>
+        <w:pStyle w:val="Heading2"/>
+      </w:pPr>
+      <w:r>
+        <w:t>Counterfactual scenarios and sensitivity analysis</w:t>
+      </w:r>
+    </w:p>
+    <w:p>
+      <w:r>
+        <w:t>Three counterfactual scenarios were constructed for Japan. Scenario A assumed Japan's equipment density was reduced to the OECD median. The transmission chain is modeled explicitly: (i) equipment density reduction implies proportionally lower equipment-related healthcare spending; (ii) we estimate that equipment-related spending comprises approximately 15% of CHE (based on OECD health capital expenditure accounts; this is an approximation subject to sensitivity analysis); (iii) the reduction in domestic equipment-related spending reduces the I-O multiplier by half the proportional equipment share reduction, reflecting that some equipment spending flows to imports rather than domestic production; (iv) the effective multiplier is then further adjusted for import leakage.</w:t>
+      </w:r>
+    </w:p>
+    <w:p>
+      <w:r>
+        <w:t>Scenario B assumed complete domestic manufacturing (zero import leakage); Scenario C combined both adjustments. Because the equipment-related CHE share (15%) is an approximation, we conducted sensitivity analysis varying this parameter from 5% to 25% in 5-percentage-point increments (see Results).</w:t>
+      </w:r>
+    </w:p>
+    <w:p>
+      <w:pPr>
+        <w:pStyle w:val="Heading2"/>
+      </w:pPr>
+      <w:r>
+        <w:t>Preston Curve overfit test</w:t>
+      </w:r>
+    </w:p>
+    <w:p>
+      <w:r>
+        <w:t>The relationship between CHE (as a percentage of GDP) and life expectancy was analyzed using nested-model F-tests</w:t>
       </w:r>
       <w:r>
         <w:rPr>
           <w:sz w:val="20"/>
           <w:vertAlign w:val="superscript"/>
         </w:rPr>
-        <w:t>28</w:t>
-      </w:r>
-      <w:r>
-        <w:t>.</w:t>
-      </w:r>
-    </w:p>
-    <w:p>
-      <w:r>
-        <w:t>The aim of this study was to (1) evaluate the sustainability of Japan's healthcare expenditure from a neutral standpoint as both cost and economic effect, using a dual-return framework integrating demand-side I-O multipliers and supply-side health-capital tempo effects, (2) quantify the role of diagnostic equipment stock and import leakage, (3) construct counterfactual scenarios with sensitivity analysis, and (4) benchmark Japan against 12 additional OECD countries.</w:t>
+        <w:t>29</w:t>
+      </w:r>
+      <w:r>
+        <w:t>. Models were fit with and without the US, and compared using F-statistics, AIC, BIC, and LOOCV RMSE.</w:t>
       </w:r>
     </w:p>
     <w:p>
@@ -465,7 +795,7 @@
         <w:pStyle w:val="Heading1"/>
       </w:pPr>
       <w:r>
-        <w:t>Methods</w:t>
+        <w:t>Results</w:t>
       </w:r>
     </w:p>
     <w:p>
@@ -473,359 +803,29 @@
         <w:pStyle w:val="Heading2"/>
       </w:pPr>
       <w:r>
-        <w:t>Study design and data sources</w:t>
+        <w:t>I-O multipliers and fiscal return ratios</w:t>
       </w:r>
     </w:p>
     <w:p>
       <w:r>
-        <w:t>This study is a cross-country ecological analysis using publicly available data from OECD Health at a Glance 2023</w:t>
+        <w:t>Table 1 presents the healthcare sector I-O output multipliers for the 13 selected countries. Japan had the highest multiplier at 2.78 (95% CI: 2.74-2.90)</w:t>
       </w:r>
       <w:r>
         <w:rPr>
           <w:sz w:val="20"/>
           <w:vertAlign w:val="superscript"/>
         </w:rPr>
-        <w:t>4,23</w:t>
-      </w:r>
-      <w:r>
-        <w:t>, the World Bank World Development Indicators</w:t>
+        <w:t>7</w:t>
+      </w:r>
+      <w:r>
+        <w:t>, followed by France (2.20), Germany (2.10), and Sweden (2.05). The US had the lowest multiplier at 1.70</w:t>
       </w:r>
       <w:r>
         <w:rPr>
           <w:sz w:val="20"/>
           <w:vertAlign w:val="superscript"/>
         </w:rPr>
-        <w:t>21</w:t>
-      </w:r>
-      <w:r>
-        <w:t>, published I-O studies of healthcare sectors</w:t>
-      </w:r>
-      <w:r>
-        <w:rPr>
-          <w:sz w:val="20"/>
-          <w:vertAlign w:val="superscript"/>
-        </w:rPr>
-        <w:t>1-3,6,20</w:t>
-      </w:r>
-      <w:r>
-        <w:t>, Health-Led Growth Hypothesis panel studies</w:t>
-      </w:r>
-      <w:r>
-        <w:rPr>
-          <w:sz w:val="20"/>
-          <w:vertAlign w:val="superscript"/>
-        </w:rPr>
-        <w:t>7-11</w:t>
-      </w:r>
-      <w:r>
-        <w:t>, pharmaceutical/device trade statistics</w:t>
-      </w:r>
-      <w:r>
-        <w:rPr>
-          <w:sz w:val="20"/>
-          <w:vertAlign w:val="superscript"/>
-        </w:rPr>
-        <w:t>24</w:t>
-      </w:r>
-      <w:r>
-        <w:t>, and Japanese fiscal data from the Ministry of Finance</w:t>
-      </w:r>
-      <w:r>
-        <w:rPr>
-          <w:sz w:val="20"/>
-          <w:vertAlign w:val="superscript"/>
-        </w:rPr>
-        <w:t>25</w:t>
-      </w:r>
-      <w:r>
-        <w:t xml:space="preserve"> and Bank of Japan</w:t>
-      </w:r>
-      <w:r>
-        <w:rPr>
-          <w:sz w:val="20"/>
-          <w:vertAlign w:val="superscript"/>
-        </w:rPr>
-        <w:t>30</w:t>
-      </w:r>
-      <w:r>
-        <w:t>. As an analysis of publicly available aggregate data, no ethical approval was required.</w:t>
-      </w:r>
-    </w:p>
-    <w:p>
-      <w:pPr>
-        <w:pStyle w:val="Heading2"/>
-      </w:pPr>
-      <w:r>
-        <w:t>Country selection</w:t>
-      </w:r>
-    </w:p>
-    <w:p>
-      <w:r>
-        <w:t>Thirteen OECD countries were selected based on availability of healthcare sector I-O multiplier estimates: Japan, USA, Germany, Australia, Korea, Italy, France, UK, Canada, Sweden, Spain, Netherlands, and Finland. All countries had either a direct I-O study published in a peer-reviewed journal or backward-linkage coefficients from the EU-28 framework study</w:t>
-      </w:r>
-      <w:r>
-        <w:rPr>
-          <w:sz w:val="20"/>
-          <w:vertAlign w:val="superscript"/>
-        </w:rPr>
-        <w:t>3</w:t>
-      </w:r>
-      <w:r>
-        <w:t>.</w:t>
-      </w:r>
-    </w:p>
-    <w:p>
-      <w:pPr>
-        <w:pStyle w:val="Heading2"/>
-      </w:pPr>
-      <w:r>
-        <w:t>Fiscal return ratio</w:t>
-      </w:r>
-    </w:p>
-    <w:p>
-      <w:r>
-        <w:t>For each country, we calculated a demand-side fiscal return ratio as an indicator of whether healthcare-induced economic activity generates sufficient tax revenue to cover public healthcare costs:</w:t>
-      </w:r>
-    </w:p>
-    <w:p>
-      <w:pPr>
-        <w:jc w:val="center"/>
-      </w:pPr>
-      <w:r>
-        <w:rPr>
-          <w:i/>
-          <w:sz w:val="24"/>
-        </w:rPr>
-        <w:t>Fiscal Return Ratio = (τ × m) / pf</w:t>
-      </w:r>
-    </w:p>
-    <w:p>
-      <w:r>
-        <w:t>where τ is the effective tax rate (total tax and social insurance contributions as a proportion of GDP), m is the healthcare sector I-O output multiplier, and pf is the public financing share of CHE.</w:t>
-      </w:r>
-    </w:p>
-    <w:p>
-      <w:r>
-        <w:t>A critical methodological caveat must be noted: the I-O multipliers used in this study are output multipliers, measuring total production induced per unit of final demand. These differ from value-added (VA) multipliers, which measure the GDP contribution by subtracting intermediate inputs. Because the effective tax rate τ is expressed as tax revenue divided by GDP (a value-added measure), multiplying τ by an output multiplier conflates output and value added, potentially overstating the induced tax revenue. We therefore present results using both output multipliers (as an upper bound) and approximate VA multipliers (output multiplier times the sector-specific VA/output ratio, approximately 0.55-0.60 for healthcare in OECD countries</w:t>
-      </w:r>
-      <w:r>
-        <w:rPr>
-          <w:sz w:val="20"/>
-          <w:vertAlign w:val="superscript"/>
-        </w:rPr>
-        <w:t>3</w:t>
-      </w:r>
-      <w:r>
-        <w:t>) as a more conservative estimate. Neither estimate accounts for opportunity costs: in an economy near full employment, resources employed in healthcare would generate alternative output and tax revenue elsewhere, reducing the net fiscal return attributable to healthcare spending.</w:t>
-      </w:r>
-    </w:p>
-    <w:p>
-      <w:r>
-        <w:t>Additionally, we computed a deficit-adjusted variant of the ratio. When the public financing share is partly funded by deficit (bond) issuance rather than current taxation, a ratio above 1.0 reflects only a temporary flow of single-year tax revenue and does not account for the long-term cost of servicing the accumulated debt</w:t>
-      </w:r>
-      <w:r>
-        <w:rPr>
-          <w:sz w:val="20"/>
-          <w:vertAlign w:val="superscript"/>
-        </w:rPr>
-        <w:t>25,30</w:t>
-      </w:r>
-      <w:r>
-        <w:t>. For Japan, the general account deficit dependency ratio was approximately 35% in recent fiscal years. We report results both with and without this adjustment.</w:t>
-      </w:r>
-    </w:p>
-    <w:p>
-      <w:pPr>
-        <w:pStyle w:val="Heading2"/>
-      </w:pPr>
-      <w:r>
-        <w:t>Tempo model specification</w:t>
-      </w:r>
-    </w:p>
-    <w:p>
-      <w:r>
-        <w:t>The tempo model, fully specified in the companion proof-of-concept (publicly available at ref 19), captures supply-side health-capital accumulation. The model treats health expenditure as a stock-building flow with a time-varying spending-to-outcome lag:</w:t>
-      </w:r>
-    </w:p>
-    <w:p>
-      <w:pPr>
-        <w:jc w:val="center"/>
-      </w:pPr>
-      <w:r>
-        <w:rPr>
-          <w:i/>
-          <w:sz w:val="24"/>
-        </w:rPr>
-        <w:t>LE(t) = α + β · H_stock(t) + ε(t)</w:t>
-      </w:r>
-    </w:p>
-    <w:p>
-      <w:r>
-        <w:t>where LE(t) is life expectancy at birth, H_stock(t) is the health-capital stock constructed via perpetual inventory method from per-capita health expenditure (PPP) using World Bank data (2000-2019, 39 countries). The investment-to-outcome lag is specified as:</w:t>
-      </w:r>
-    </w:p>
-    <w:p>
-      <w:pPr>
-        <w:jc w:val="center"/>
-      </w:pPr>
-      <w:r>
-        <w:rPr>
-          <w:i/>
-          <w:sz w:val="24"/>
-        </w:rPr>
-        <w:t>μ_H(t) = μ_H0 + μ_H1 × (year − t₀)</w:t>
-      </w:r>
-    </w:p>
-    <w:p>
-      <w:r>
-        <w:t>Three model variants were compared: M0 (flow-only, no lag, 2 parameters), M1 (constant lag μ* = 4 years, 3 parameters), and M2 (time-varying lag, 5 parameters: intercept, slope, μ_H0, μ_H1, and drift variance). The dependent variable was life expectancy at birth; estimation was by nonlinear least squares with grid search over the lag parameters. Key M2 point estimates: μ_H0 = 3.2 years (SE = 0.8), μ_H1 = +0.15 yr/yr (SE = 0.04), where μ_H0 is the initial spending-to-outcome lag and μ_H1 is the annual drift in this lag</w:t>
-      </w:r>
-      <w:r>
-        <w:rPr>
-          <w:sz w:val="20"/>
-          <w:vertAlign w:val="superscript"/>
-        </w:rPr>
-        <w:t>19</w:t>
-      </w:r>
-      <w:r>
-        <w:t>.</w:t>
-      </w:r>
-    </w:p>
-    <w:p>
-      <w:pPr>
-        <w:pStyle w:val="Heading2"/>
-      </w:pPr>
-      <w:r>
-        <w:t>Model selection criteria</w:t>
-      </w:r>
-    </w:p>
-    <w:p>
-      <w:r>
-        <w:t>To ensure symmetric application of model selection criteria across all analyses (as applied to the Preston Curve test below), we evaluated all tempo model variants using: (a) in-sample level RMSE, (b) change RMSE, (c) leave-one-out cross-validation (LOOCV) RMSE, (d) Akaike Information Criterion (AIC), and (e) Bayesian Information Criterion (BIC). AIC and BIC penalize model complexity, with BIC imposing a heavier penalty for additional parameters. All criteria are reported in Table 3.</w:t>
-      </w:r>
-    </w:p>
-    <w:p>
-      <w:pPr>
-        <w:pStyle w:val="Heading2"/>
-      </w:pPr>
-      <w:r>
-        <w:t>Equipment stock and import leakage model</w:t>
-      </w:r>
-    </w:p>
-    <w:p>
-      <w:r>
-        <w:t>Diagnostic imaging equipment density was defined as the sum of CT scanners and MRI units per million population</w:t>
-      </w:r>
-      <w:r>
-        <w:rPr>
-          <w:sz w:val="20"/>
-          <w:vertAlign w:val="superscript"/>
-        </w:rPr>
-        <w:t>23</w:t>
-      </w:r>
-      <w:r>
-        <w:t>. Medical import leakage was calculated as the net imports of pharmaceuticals (HS30) and medical devices (HS9018-22) divided by CHE</w:t>
-      </w:r>
-      <w:r>
-        <w:rPr>
-          <w:sz w:val="20"/>
-          <w:vertAlign w:val="superscript"/>
-        </w:rPr>
-        <w:t>24</w:t>
-      </w:r>
-      <w:r>
-        <w:t>. The effective I-O multiplier was defined as:</w:t>
-      </w:r>
-    </w:p>
-    <w:p>
-      <w:pPr>
-        <w:jc w:val="center"/>
-      </w:pPr>
-      <w:r>
-        <w:rPr>
-          <w:i/>
-          <w:sz w:val="24"/>
-        </w:rPr>
-        <w:t>m_eff = m × (1 − import leakage rate)</w:t>
-      </w:r>
-    </w:p>
-    <w:p>
-      <w:pPr>
-        <w:pStyle w:val="Heading2"/>
-      </w:pPr>
-      <w:r>
-        <w:t>Counterfactual scenarios and sensitivity analysis</w:t>
-      </w:r>
-    </w:p>
-    <w:p>
-      <w:r>
-        <w:t>Three counterfactual scenarios were constructed for Japan. Scenario A assumed Japan's equipment density was reduced to the OECD median. The transmission chain is modeled explicitly: (i) equipment density reduction implies proportionally lower equipment-related healthcare spending; (ii) we estimate that equipment-related spending comprises approximately 15% of CHE (based on OECD health capital expenditure accounts; this is an approximation subject to sensitivity analysis); (iii) the reduction in domestic equipment-related spending reduces the I-O multiplier by half the proportional equipment share reduction, reflecting that some equipment spending flows to imports rather than domestic production; (iv) the effective multiplier is then further adjusted for import leakage.</w:t>
-      </w:r>
-    </w:p>
-    <w:p>
-      <w:r>
-        <w:t>Scenario B assumed complete domestic manufacturing (zero import leakage); Scenario C combined both adjustments. Because the equipment-related CHE share (15%) is an approximation, we conducted sensitivity analysis varying this parameter from 5% to 25% in 5-percentage-point increments (Table 5, Figure 9).</w:t>
-      </w:r>
-    </w:p>
-    <w:p>
-      <w:pPr>
-        <w:pStyle w:val="Heading2"/>
-      </w:pPr>
-      <w:r>
-        <w:t>Preston Curve overfit test</w:t>
-      </w:r>
-    </w:p>
-    <w:p>
-      <w:r>
-        <w:t>The relationship between CHE (as a percentage of GDP) and life expectancy was analyzed using nested-model F-tests</w:t>
-      </w:r>
-      <w:r>
-        <w:rPr>
-          <w:sz w:val="20"/>
-          <w:vertAlign w:val="superscript"/>
-        </w:rPr>
-        <w:t>22</w:t>
-      </w:r>
-      <w:r>
-        <w:t>. Models were fit with and without the US, and compared using F-statistics, AIC, BIC, and LOOCV RMSE.</w:t>
-      </w:r>
-    </w:p>
-    <w:p>
-      <w:pPr>
-        <w:pStyle w:val="Heading1"/>
-      </w:pPr>
-      <w:r>
-        <w:t>Results</w:t>
-      </w:r>
-    </w:p>
-    <w:p>
-      <w:pPr>
-        <w:pStyle w:val="Heading2"/>
-      </w:pPr>
-      <w:r>
-        <w:t>I-O multipliers and fiscal return ratios</w:t>
-      </w:r>
-    </w:p>
-    <w:p>
-      <w:r>
-        <w:t>Table 1 presents the healthcare sector I-O output multipliers for the 13 selected countries. Japan had the highest multiplier at 2.78 (95% CI: 2.74-2.90)</w:t>
-      </w:r>
-      <w:r>
-        <w:rPr>
-          <w:sz w:val="20"/>
-          <w:vertAlign w:val="superscript"/>
-        </w:rPr>
-        <w:t>1</w:t>
-      </w:r>
-      <w:r>
-        <w:t>, followed by France (2.20), Germany (2.10), and Sweden (2.05). The US had the lowest multiplier at 1.70</w:t>
-      </w:r>
-      <w:r>
-        <w:rPr>
-          <w:sz w:val="20"/>
-          <w:vertAlign w:val="superscript"/>
-        </w:rPr>
-        <w:t>2</w:t>
+        <w:t>8</w:t>
       </w:r>
       <w:r>
         <w:t>; however, the US estimate is based on Medicare spending only, which is not directly comparable to whole-sector multipliers for other countries. The multiplier estimates also differ in estimation year (2006-2017) and method (direct national I-O studies vs EU-28 backward-linkage coefficients), and these differences limit strict cross-country comparison. Figure 2 displays the multipliers.</w:t>
@@ -3470,7 +3470,7 @@
           <w:sz w:val="20"/>
           <w:vertAlign w:val="superscript"/>
         </w:rPr>
-        <w:t>19</w:t>
+        <w:t>23</w:t>
       </w:r>
       <w:r>
         <w:t>. Figure 4 shows the three-layer tempo comparison.</w:t>
@@ -3952,7 +3952,7 @@
           <w:sz w:val="20"/>
           <w:vertAlign w:val="superscript"/>
         </w:rPr>
-        <w:t>23</w:t>
+        <w:t>24</w:t>
       </w:r>
       <w:r>
         <w:t xml:space="preserve"> (Figure 6).</w:t>
@@ -4909,7 +4909,7 @@
           <w:sz w:val="20"/>
           <w:vertAlign w:val="superscript"/>
         </w:rPr>
-        <w:t>29</w:t>
+        <w:t>30</w:t>
       </w:r>
       <w:r>
         <w:t>, artificially inflating apparent economic returns. The current analysis cannot distinguish between value-generating diagnostic activity and wasteful over-utilization; this distinction requires micro-level data on diagnostic yield and clinical outcomes.</w:t>
@@ -4932,7 +4932,7 @@
           <w:sz w:val="20"/>
           <w:vertAlign w:val="superscript"/>
         </w:rPr>
-        <w:t>29</w:t>
+        <w:t>30</w:t>
       </w:r>
       <w:r>
         <w:t>. If a substantial fraction of the equipment-related economic activity reflects low-value utilization, the fiscal return ratio overstates the true sustainability benefit.</w:t>
@@ -4941,6 +4941,16 @@
     <w:p>
       <w:r>
         <w:t>Moreover, the current service level has been maintained through excessive, often uncompensated physician overtime. Japan's physician density (2.5 per 1,000) is among the lowest in the OECD</w:t>
+      </w:r>
+      <w:r>
+        <w:rPr>
+          <w:sz w:val="20"/>
+          <w:vertAlign w:val="superscript"/>
+        </w:rPr>
+        <w:t>26</w:t>
+      </w:r>
+      <w:r>
+        <w:t>, yet Japanese patients enjoy the fastest access to specialist care globally. With the enforcement of work-style reform legislation capping physician overtime</w:t>
       </w:r>
       <w:r>
         <w:rPr>
@@ -4950,16 +4960,6 @@
         <w:t>27</w:t>
       </w:r>
       <w:r>
-        <w:t>, yet Japanese patients enjoy the fastest access to specialist care globally. With the enforcement of work-style reform legislation capping physician overtime</w:t>
-      </w:r>
-      <w:r>
-        <w:rPr>
-          <w:sz w:val="20"/>
-          <w:vertAlign w:val="superscript"/>
-        </w:rPr>
-        <w:t>28</w:t>
-      </w:r>
-      <w:r>
         <w:t>, maintaining current service levels may be practically impossible without either increasing physician numbers (which would raise labor costs and reduce the multiplier-based fiscal return) or reducing service volume (which would reduce equipment utilization and the multiplier itself). This labor constraint represents a threat to the sustainability framework's assumptions.</w:t>
       </w:r>
     </w:p>
@@ -4980,7 +4980,7 @@
           <w:sz w:val="20"/>
           <w:vertAlign w:val="superscript"/>
         </w:rPr>
-        <w:t>26</w:t>
+        <w:t>5</w:t>
       </w:r>
       <w:r>
         <w:t>. Per-capita healthcare expenditure for enrollees aged 75+ is approximately four times that of the working-age population, and this system is cross-subsidized by working-age insurance schemes. As the proportion of late-stage elderly grows (projected to reach 20% of the population by 2040), the cross-subsidy burden on the shrinking working-age population intensifies. A limitation of the current analysis is that it treats healthcare expenditure as a homogeneous aggregate; separate analyses for the late-stage elderly and working-age populations would yield different multiplier effects and fiscal return ratios. This disaggregation is an important direction for future research.</w:t>
@@ -5003,7 +5003,7 @@
           <w:sz w:val="20"/>
           <w:vertAlign w:val="superscript"/>
         </w:rPr>
-        <w:t>25</w:t>
+        <w:t>3</w:t>
       </w:r>
       <w:r>
         <w:t>, and the accumulated public debt exceeds 250% of GDP</w:t>
@@ -5013,7 +5013,7 @@
           <w:sz w:val="20"/>
           <w:vertAlign w:val="superscript"/>
         </w:rPr>
-        <w:t>30</w:t>
+        <w:t>4</w:t>
       </w:r>
       <w:r>
         <w:t>. If this deficit dependency is applied proportionally to healthcare, the demand-side fiscal return covers only the tax-funded portion of public healthcare costs; the deficit-funded portion (approximately 29% of public CHE) represents an intergenerational transfer whose 'return' depends on whether the health capital accumulated today generates sufficient future economic activity to service the debt. This intertemporal dimension is not captured by the cross-sectional fiscal return ratio. For international comparison, countries with low deficit dependency (Sweden 2%, Netherlands 3%, Germany 4%) face a less severe version of this problem, while the US (25%) and Australia (18%) share a qualitatively similar challenge.</w:t>
@@ -5036,7 +5036,7 @@
           <w:sz w:val="20"/>
           <w:vertAlign w:val="superscript"/>
         </w:rPr>
-        <w:t>27</w:t>
+        <w:t>26</w:t>
       </w:r>
       <w:r>
         <w:t>.</w:t>
@@ -5387,7 +5387,7 @@
         <w:t xml:space="preserve">1. </w:t>
       </w:r>
       <w:r>
-        <w:t>Yamada G, Imanaka Y. Input-output analysis on the economic impact of medical care in Japan. Environ Health Prev Med. 2015;20(5):379-387.</w:t>
+        <w:t>OECD. Health at a Glance 2023: OECD Indicators. Paris: OECD Publishing; 2023.</w:t>
       </w:r>
     </w:p>
     <w:p>
@@ -5398,7 +5398,7 @@
         <w:t xml:space="preserve">2. </w:t>
       </w:r>
       <w:r>
-        <w:t>Dupor B, Guerrero R. The aggregate and local economic effects of government financed health care. Econ Inq. 2021;59(2):662-670.</w:t>
+        <w:t>Cabinet Office, Japan. Annual Report on the Japanese Economy 2025. Tokyo: Cabinet Office; 2025. [In Japanese]</w:t>
       </w:r>
     </w:p>
     <w:p>
@@ -5409,7 +5409,7 @@
         <w:t xml:space="preserve">3. </w:t>
       </w:r>
       <w:r>
-        <w:t>Gutierrez-Hernandez I, Abasolo-Alesson I. The health care sector in the economies of the European Union: an overview using an input-output framework. Cost Eff Resour Alloc. 2021;19(1):4.</w:t>
+        <w:t>Ministry of Finance, Japan. Highlights of the Budget for FY2024. Tokyo: MOF; 2024. Available from: https://www.mof.go.jp/english/policy/budget/budget/</w:t>
       </w:r>
     </w:p>
     <w:p>
@@ -5420,7 +5420,7 @@
         <w:t xml:space="preserve">4. </w:t>
       </w:r>
       <w:r>
-        <w:t>OECD. Health at a Glance 2023: OECD Indicators. Paris: OECD Publishing; 2023.</w:t>
+        <w:t>Bank of Japan. Flow of Funds Accounts. Tokyo: BOJ; 2024. Available from: https://www.boj.or.jp/en/statistics/sj/</w:t>
       </w:r>
     </w:p>
     <w:p>
@@ -5431,7 +5431,7 @@
         <w:t xml:space="preserve">5. </w:t>
       </w:r>
       <w:r>
-        <w:t>Cabinet Office, Japan. Annual Report on the Japanese Economy 2025. Tokyo: Cabinet Office; 2025. [In Japanese]</w:t>
+        <w:t>Ministry of Health, Labour and Welfare. Annual Health, Labour and Welfare Report 2023. Tokyo: MHLW; 2023. [In Japanese]</w:t>
       </w:r>
     </w:p>
     <w:p>
@@ -5453,7 +5453,7 @@
         <w:t xml:space="preserve">7. </w:t>
       </w:r>
       <w:r>
-        <w:t>Ertugrul HM, Baycan O, Atilgan E, Ulucan H. Health-led growth hypothesis and health financing systems: an econometric synthesis for OECD countries. Front Public Health. 2024;12:1437304.</w:t>
+        <w:t>Yamada G, Imanaka Y. Input-output analysis on the economic impact of medical care in Japan. Environ Health Prev Med. 2015;20(5):379-387.</w:t>
       </w:r>
     </w:p>
     <w:p>
@@ -5464,7 +5464,7 @@
         <w:t xml:space="preserve">8. </w:t>
       </w:r>
       <w:r>
-        <w:t>Amiri A, Ventelou B. Granger causality between total expenditure on health and GDP in OECD: Evidence from the Toda-Yamamoto approach. Econ Lett. 2012;116(3):541-544.</w:t>
+        <w:t>Dupor B, Guerrero R. The aggregate and local economic effects of government financed health care. Econ Inq. 2021;59(2):662-670.</w:t>
       </w:r>
     </w:p>
     <w:p>
@@ -5475,7 +5475,7 @@
         <w:t xml:space="preserve">9. </w:t>
       </w:r>
       <w:r>
-        <w:t>Beylik U, Cetin M, Senol O, Cirakli U, Ecevit E. The relationship between health expenditure indicators and economic growth in OECD countries: A Driscoll-Kraay approach. Front Public Health. 2022;10:1050550.</w:t>
+        <w:t>Gutierrez-Hernandez I, Abasolo-Alesson I. The health care sector in the economies of the European Union: an overview using an input-output framework. Cost Eff Resour Alloc. 2021;19(1):4.</w:t>
       </w:r>
     </w:p>
     <w:p>
@@ -5486,7 +5486,7 @@
         <w:t xml:space="preserve">10. </w:t>
       </w:r>
       <w:r>
-        <w:t>Wang KM. Health care expenditure and economic growth: Quantile panel-type analysis. Econ Model. 2011;28(4):1536-1549.</w:t>
+        <w:t>Henke KD, Ostwald DA. Health satellite account: the first step. Int J Behav Healthc Res. 2012;3(2):91-105.</w:t>
       </w:r>
     </w:p>
     <w:p>
@@ -5497,7 +5497,7 @@
         <w:t xml:space="preserve">11. </w:t>
       </w:r>
       <w:r>
-        <w:t>Piabuo SM, Tieguhong JC. Health expenditure and economic growth - a review of the literature and an analysis between the economic community for central African states (CEMAC) and selected African countries. Health Econ Rev. 2017;7(1):23.</w:t>
+        <w:t>Mushkin SJ. Health as an investment. J Polit Econ. 1962;70(5):129-157.</w:t>
       </w:r>
     </w:p>
     <w:p>
@@ -5508,7 +5508,7 @@
         <w:t xml:space="preserve">12. </w:t>
       </w:r>
       <w:r>
-        <w:t>Mushkin SJ. Health as an investment. J Polit Econ. 1962;70(5):129-157.</w:t>
+        <w:t>Grossman M. On the concept of health capital and the demand for health. J Polit Econ. 1972;80(2):223-255.</w:t>
       </w:r>
     </w:p>
     <w:p>
@@ -5519,7 +5519,7 @@
         <w:t xml:space="preserve">13. </w:t>
       </w:r>
       <w:r>
-        <w:t>Grossman M. On the concept of health capital and the demand for health. J Polit Econ. 1972;80(2):223-255.</w:t>
+        <w:t>Bloom DE, Canning D, Sevilla J. The effect of health on economic growth: a production function approach. World Dev. 2004;32(1):1-13.</w:t>
       </w:r>
     </w:p>
     <w:p>
@@ -5530,7 +5530,7 @@
         <w:t xml:space="preserve">14. </w:t>
       </w:r>
       <w:r>
-        <w:t>Bloom DE, Canning D, Sevilla J. The effect of health on economic growth: a production function approach. World Dev. 2004;32(1):1-13.</w:t>
+        <w:t>Barro RJ. Health and economic growth. Ann Econ Finance. 2013;14(2):305-342.</w:t>
       </w:r>
     </w:p>
     <w:p>
@@ -5541,7 +5541,7 @@
         <w:t xml:space="preserve">15. </w:t>
       </w:r>
       <w:r>
-        <w:t>Barro RJ. Health and economic growth. Ann Econ Finance. 2013;14(2):305-342.</w:t>
+        <w:t>Ertugrul HM, Baycan O, Atilgan E, Ulucan H. Health-led growth hypothesis and health financing systems: an econometric synthesis for OECD countries. Front Public Health. 2024;12:1437304.</w:t>
       </w:r>
     </w:p>
     <w:p>
@@ -5552,7 +5552,7 @@
         <w:t xml:space="preserve">16. </w:t>
       </w:r>
       <w:r>
-        <w:t>Bongaarts J, Feeney G. On the quantum and tempo of fertility. Popul Dev Rev. 1998;24(2):271-291.</w:t>
+        <w:t>Amiri A, Ventelou B. Granger causality between total expenditure on health and GDP in OECD: Evidence from the Toda-Yamamoto approach. Econ Lett. 2012;116(3):541-544.</w:t>
       </w:r>
     </w:p>
     <w:p>
@@ -5563,7 +5563,7 @@
         <w:t xml:space="preserve">17. </w:t>
       </w:r>
       <w:r>
-        <w:t>Goldstein JR, Lutz W, Scherbov S. Long-term population decline in Europe: the relative importance of tempo effects and generational length. Popul Dev Rev. 2003;29(4):699-707.</w:t>
+        <w:t>Beylik U, Cirakli U, Cetin M, Ecevit E, Senol O. The relationship between health expenditure indicators and economic growth in OECD countries: A Driscoll-Kraay approach. Front Public Health. 2022;10:1050550.</w:t>
       </w:r>
     </w:p>
     <w:p>
@@ -5574,7 +5574,7 @@
         <w:t xml:space="preserve">18. </w:t>
       </w:r>
       <w:r>
-        <w:t>Onishi T. The forgotten tempo effect in capital accounting: investment-to-output time-to-build, intangible capital, and the reconciliation of flow- and stock-based national wealth measures. Working Paper. 2026. Available from: https://github.com/bougtoir/gdp-tempo-paper</w:t>
+        <w:t>Wang KM. Health care expenditure and economic growth: Quantile panel-type analysis. Econ Model. 2011;28(4):1536-1549.</w:t>
       </w:r>
     </w:p>
     <w:p>
@@ -5585,7 +5585,7 @@
         <w:t xml:space="preserve">19. </w:t>
       </w:r>
       <w:r>
-        <w:t>Onishi T. Healthcare sustainable-spending composition via tempo + sigma framework: model specification A-H proof of concept. Working Paper. 2026. Available from: https://github.com/bougtoir/healthcare-sustainable</w:t>
+        <w:t>Piabuo SM, Tieguhong JC. Health expenditure and economic growth - a review of the literature and an analysis between the economic community for central African states (CEMAC) and selected African countries. Health Econ Rev. 2017;7(1):23.</w:t>
       </w:r>
     </w:p>
     <w:p>
@@ -5596,7 +5596,7 @@
         <w:t xml:space="preserve">20. </w:t>
       </w:r>
       <w:r>
-        <w:t>Henke KD, Ostwald DA. Health satellite account: the first step. In: Dged JM, ed. The Elgar Companion to Health Economics. 2nd ed. Cheltenham: Edward Elgar; 2012. p. 327-337.</w:t>
+        <w:t>Bongaarts J, Feeney G. On the quantum and tempo of fertility. Popul Dev Rev. 1998;24(2):271-291.</w:t>
       </w:r>
     </w:p>
     <w:p>
@@ -5607,7 +5607,7 @@
         <w:t xml:space="preserve">21. </w:t>
       </w:r>
       <w:r>
-        <w:t>World Bank. World Development Indicators. Washington, DC: World Bank; 2024. Available from: https://databank.worldbank.org/</w:t>
+        <w:t>Goldstein JR, Lutz W, Scherbov S. Long-term population decline in Europe: the relative importance of tempo effects and generational length. Popul Dev Rev. 2003;29(4):699-707.</w:t>
       </w:r>
     </w:p>
     <w:p>
@@ -5618,7 +5618,7 @@
         <w:t xml:space="preserve">22. </w:t>
       </w:r>
       <w:r>
-        <w:t>Preston SH. The changing relation between mortality and level of economic development. Popul Stud. 1975;29(2):231-248.</w:t>
+        <w:t>Onishi T. The forgotten tempo effect in capital accounting: investment-to-output time-to-build, intangible capital, and the reconciliation of flow- and stock-based national wealth measures. Working Paper. 2026. Available from: https://github.com/bougtoir/gdp-tempo-paper</w:t>
       </w:r>
     </w:p>
     <w:p>
@@ -5629,7 +5629,7 @@
         <w:t xml:space="preserve">23. </w:t>
       </w:r>
       <w:r>
-        <w:t>OECD. Health at a Glance 2023: OECD Indicators. Chapter 5.23: Diagnostic technologies. Paris: OECD Publishing; 2023.</w:t>
+        <w:t>Onishi T. Healthcare sustainable-spending composition via tempo + sigma framework: model specification A-H proof of concept. Working Paper. 2026. Available from: https://github.com/bougtoir/healthcare-sustainable</w:t>
       </w:r>
     </w:p>
     <w:p>
@@ -5640,7 +5640,7 @@
         <w:t xml:space="preserve">24. </w:t>
       </w:r>
       <w:r>
-        <w:t>Ministry of Health, Labour and Welfare. Pharmaceutical and medical device production statistics annual report. Tokyo: MHLW; 2021. [In Japanese]</w:t>
+        <w:t>OECD. Health at a Glance 2023: OECD Indicators. Chapter 5.23: Diagnostic technologies. Paris: OECD Publishing; 2023.</w:t>
       </w:r>
     </w:p>
     <w:p>
@@ -5651,7 +5651,7 @@
         <w:t xml:space="preserve">25. </w:t>
       </w:r>
       <w:r>
-        <w:t>Ministry of Finance, Japan. Highlights of the Budget for FY2024. Tokyo: MOF; 2024. Available from: https://www.mof.go.jp/english/policy/budget/budget/</w:t>
+        <w:t>Ministry of Health, Labour and Welfare. Pharmaceutical and medical device production statistics annual report. Tokyo: MHLW; 2021. [In Japanese]</w:t>
       </w:r>
     </w:p>
     <w:p>
@@ -5662,7 +5662,7 @@
         <w:t xml:space="preserve">26. </w:t>
       </w:r>
       <w:r>
-        <w:t>Ministry of Health, Labour and Welfare. Annual Health, Labour and Welfare Report 2023. Tokyo: MHLW; 2023. [In Japanese]</w:t>
+        <w:t>OECD. Health at a Glance 2023: OECD Indicators. Chapter 8.1: Health workforce. Paris: OECD Publishing; 2023.</w:t>
       </w:r>
     </w:p>
     <w:p>
@@ -5673,7 +5673,7 @@
         <w:t xml:space="preserve">27. </w:t>
       </w:r>
       <w:r>
-        <w:t>OECD. Health at a Glance 2023: OECD Indicators. Chapter 8.1: Health workforce. Paris: OECD Publishing; 2023.</w:t>
+        <w:t>Koike S, Wada H, Ohde S, Ide H, Taneda K, Tanigawa T. Working hours of full-time hospital physicians in Japan: a cross-sectional nationwide survey. BMC Public Health. 2024;24:164.</w:t>
       </w:r>
     </w:p>
     <w:p>
@@ -5684,7 +5684,7 @@
         <w:t xml:space="preserve">28. </w:t>
       </w:r>
       <w:r>
-        <w:t>Hamano J, Tokuda Y. Changes in the work environment of physicians in Japan after implementation of work-style reform legislation. JAMA Netw Open. 2023;6(9):e2334855.</w:t>
+        <w:t>World Bank. World Development Indicators. Washington, DC: World Bank; 2024. Available from: https://databank.worldbank.org/</w:t>
       </w:r>
     </w:p>
     <w:p>
@@ -5695,7 +5695,7 @@
         <w:t xml:space="preserve">29. </w:t>
       </w:r>
       <w:r>
-        <w:t>Hiramatsu T, Sugiyama M, Kuwabara K. Defensive medicine in Japan: a questionnaire survey of practicing physicians. J Health Econ. 2019;66:251-264.</w:t>
+        <w:t>Preston SH. The changing relation between mortality and level of economic development. Popul Stud. 1975;29(2):231-248.</w:t>
       </w:r>
     </w:p>
     <w:p>
@@ -5706,7 +5706,7 @@
         <w:t xml:space="preserve">30. </w:t>
       </w:r>
       <w:r>
-        <w:t>Bank of Japan. Flow of Funds Accounts. Tokyo: BOJ; 2024. Available from: https://www.boj.or.jp/en/statistics/sj/</w:t>
+        <w:t>Hiyama T, Yoshihara M, Tanaka S, Urabe Y, Ikegami Y, Fukuhara T, et al. Defensive medicine practices among gastroenterologists in Japan. World J Gastroenterol. 2006;12(47):7671-7675.</w:t>
       </w:r>
     </w:p>
     <w:p>

</xml_diff>